<commit_message>
Apply mentor release guidance
</commit_message>
<xml_diff>
--- a/output/Masaar_Final_Submission.docx
+++ b/output/Masaar_Final_Submission.docx
@@ -4271,7 +4271,7 @@
                 <w:color w:val="102536"/>
                 <w:sz w:val="19"/>
               </w:rPr>
-              <w:t>No AWS profile, account credentials, RDS connection string, budget email or domain are present on this machine. The stack and CI workflow are ready, but a real public deployment cannot be completed safely without those account-owned values.</w:t>
+              <w:t>The account credentials were accepted, but AWS requires a one-time verification code sent to the account inbox before provisioning can continue. The stack and CI workflow remain ready; RDS, Secrets Manager, Cognito seeding and smoke tests follow immediately after verification.</w:t>
             </w:r>
           </w:p>
         </w:tc>
@@ -4725,6 +4725,354 @@
         <w:pageBreakBefore w:val="0"/>
       </w:pPr>
       <w:r>
+        <w:t>Judge access — local evaluation</w:t>
+      </w:r>
+    </w:p>
+    <w:tbl>
+      <w:tblPr>
+        <w:tblW w:type="dxa" w:w="9418"/>
+        <w:jc w:val="center"/>
+        <w:tblLayout w:type="fixed"/>
+        <w:tblLook w:firstColumn="1" w:firstRow="1" w:lastColumn="0" w:lastRow="0" w:noHBand="0" w:noVBand="1" w:val="04A0"/>
+        <w:tblInd w:w="120" w:type="dxa"/>
+        <w:tblBorders>
+          <w:top w:val="single" w:sz="5" w:color="D7E1E6"/>
+          <w:left w:val="single" w:sz="5" w:color="D7E1E6"/>
+          <w:bottom w:val="single" w:sz="5" w:color="D7E1E6"/>
+          <w:right w:val="single" w:sz="5" w:color="D7E1E6"/>
+          <w:insideH w:val="single" w:sz="5" w:color="D7E1E6"/>
+          <w:insideV w:val="single" w:sz="5" w:color="D7E1E6"/>
+        </w:tblBorders>
+      </w:tblPr>
+      <w:tblGrid>
+        <w:gridCol w:w="2376"/>
+        <w:gridCol w:w="7042"/>
+      </w:tblGrid>
+      <w:tr>
+        <w:tc>
+          <w:tcPr>
+            <w:tcW w:type="dxa" w:w="2376"/>
+            <w:shd w:fill="061828"/>
+            <w:tcMar>
+              <w:top w:w="90" w:type="dxa"/>
+              <w:start w:w="120" w:type="dxa"/>
+              <w:bottom w:w="90" w:type="dxa"/>
+              <w:end w:w="120" w:type="dxa"/>
+            </w:tcMar>
+            <w:vAlign w:val="center"/>
+          </w:tcPr>
+          <w:p>
+            <w:pPr>
+              <w:spacing w:after="0"/>
+            </w:pPr>
+            <w:r>
+              <w:rPr>
+                <w:rFonts w:ascii="Aptos" w:hAnsi="Aptos"/>
+                <w:b/>
+                <w:i w:val="0"/>
+                <w:color w:val="FFFFFF"/>
+                <w:sz w:val="15"/>
+              </w:rPr>
+              <w:t>Role</w:t>
+            </w:r>
+          </w:p>
+        </w:tc>
+        <w:tc>
+          <w:tcPr>
+            <w:tcW w:type="dxa" w:w="7042"/>
+            <w:shd w:fill="061828"/>
+            <w:tcMar>
+              <w:top w:w="90" w:type="dxa"/>
+              <w:start w:w="120" w:type="dxa"/>
+              <w:bottom w:w="90" w:type="dxa"/>
+              <w:end w:w="120" w:type="dxa"/>
+            </w:tcMar>
+            <w:vAlign w:val="center"/>
+          </w:tcPr>
+          <w:p>
+            <w:pPr>
+              <w:spacing w:after="0"/>
+            </w:pPr>
+            <w:r>
+              <w:rPr>
+                <w:rFonts w:ascii="Aptos" w:hAnsi="Aptos"/>
+                <w:b/>
+                <w:i w:val="0"/>
+                <w:color w:val="FFFFFF"/>
+                <w:sz w:val="15"/>
+              </w:rPr>
+              <w:t>Credentials</w:t>
+            </w:r>
+          </w:p>
+        </w:tc>
+      </w:tr>
+      <w:tr>
+        <w:tc>
+          <w:tcPr>
+            <w:tcW w:type="dxa" w:w="2376"/>
+            <w:tcMar>
+              <w:top w:w="90" w:type="dxa"/>
+              <w:start w:w="120" w:type="dxa"/>
+              <w:bottom w:w="90" w:type="dxa"/>
+              <w:end w:w="120" w:type="dxa"/>
+            </w:tcMar>
+            <w:vAlign w:val="center"/>
+          </w:tcPr>
+          <w:p>
+            <w:pPr>
+              <w:spacing w:after="0" w:line="245" w:lineRule="auto"/>
+            </w:pPr>
+            <w:r>
+              <w:rPr>
+                <w:rFonts w:ascii="Aptos" w:hAnsi="Aptos"/>
+                <w:b w:val="0"/>
+                <w:i w:val="0"/>
+                <w:color w:val="102536"/>
+                <w:sz w:val="15"/>
+              </w:rPr>
+              <w:t>Owner — Joe</w:t>
+            </w:r>
+          </w:p>
+        </w:tc>
+        <w:tc>
+          <w:tcPr>
+            <w:tcW w:type="dxa" w:w="7042"/>
+            <w:tcMar>
+              <w:top w:w="90" w:type="dxa"/>
+              <w:start w:w="120" w:type="dxa"/>
+              <w:bottom w:w="90" w:type="dxa"/>
+              <w:end w:w="120" w:type="dxa"/>
+            </w:tcMar>
+            <w:vAlign w:val="center"/>
+          </w:tcPr>
+          <w:p>
+            <w:pPr>
+              <w:spacing w:after="0" w:line="245" w:lineRule="auto"/>
+            </w:pPr>
+            <w:r>
+              <w:rPr>
+                <w:rFonts w:ascii="Aptos" w:hAnsi="Aptos"/>
+                <w:b w:val="0"/>
+                <w:i w:val="0"/>
+                <w:color w:val="102536"/>
+                <w:sz w:val="15"/>
+              </w:rPr>
+              <w:t>joe@masaar.demo  |  masaar-demo</w:t>
+            </w:r>
+          </w:p>
+        </w:tc>
+      </w:tr>
+      <w:tr>
+        <w:tc>
+          <w:tcPr>
+            <w:tcW w:type="dxa" w:w="2376"/>
+            <w:shd w:fill="F2F5F7"/>
+            <w:tcMar>
+              <w:top w:w="90" w:type="dxa"/>
+              <w:start w:w="120" w:type="dxa"/>
+              <w:bottom w:w="90" w:type="dxa"/>
+              <w:end w:w="120" w:type="dxa"/>
+            </w:tcMar>
+            <w:vAlign w:val="center"/>
+          </w:tcPr>
+          <w:p>
+            <w:pPr>
+              <w:spacing w:after="0" w:line="245" w:lineRule="auto"/>
+            </w:pPr>
+            <w:r>
+              <w:rPr>
+                <w:rFonts w:ascii="Aptos" w:hAnsi="Aptos"/>
+                <w:b w:val="0"/>
+                <w:i w:val="0"/>
+                <w:color w:val="102536"/>
+                <w:sz w:val="15"/>
+              </w:rPr>
+              <w:t>Manager — Nadim</w:t>
+            </w:r>
+          </w:p>
+        </w:tc>
+        <w:tc>
+          <w:tcPr>
+            <w:tcW w:type="dxa" w:w="7042"/>
+            <w:shd w:fill="F2F5F7"/>
+            <w:tcMar>
+              <w:top w:w="90" w:type="dxa"/>
+              <w:start w:w="120" w:type="dxa"/>
+              <w:bottom w:w="90" w:type="dxa"/>
+              <w:end w:w="120" w:type="dxa"/>
+            </w:tcMar>
+            <w:vAlign w:val="center"/>
+          </w:tcPr>
+          <w:p>
+            <w:pPr>
+              <w:spacing w:after="0" w:line="245" w:lineRule="auto"/>
+            </w:pPr>
+            <w:r>
+              <w:rPr>
+                <w:rFonts w:ascii="Aptos" w:hAnsi="Aptos"/>
+                <w:b w:val="0"/>
+                <w:i w:val="0"/>
+                <w:color w:val="102536"/>
+                <w:sz w:val="15"/>
+              </w:rPr>
+              <w:t>manager@masaar.demo  |  masaar-demo</w:t>
+            </w:r>
+          </w:p>
+        </w:tc>
+      </w:tr>
+      <w:tr>
+        <w:tc>
+          <w:tcPr>
+            <w:tcW w:type="dxa" w:w="2376"/>
+            <w:tcMar>
+              <w:top w:w="90" w:type="dxa"/>
+              <w:start w:w="120" w:type="dxa"/>
+              <w:bottom w:w="90" w:type="dxa"/>
+              <w:end w:w="120" w:type="dxa"/>
+            </w:tcMar>
+            <w:vAlign w:val="center"/>
+          </w:tcPr>
+          <w:p>
+            <w:pPr>
+              <w:spacing w:after="0" w:line="245" w:lineRule="auto"/>
+            </w:pPr>
+            <w:r>
+              <w:rPr>
+                <w:rFonts w:ascii="Aptos" w:hAnsi="Aptos"/>
+                <w:b w:val="0"/>
+                <w:i w:val="0"/>
+                <w:color w:val="102536"/>
+                <w:sz w:val="15"/>
+              </w:rPr>
+              <w:t>Employee — Rami</w:t>
+            </w:r>
+          </w:p>
+        </w:tc>
+        <w:tc>
+          <w:tcPr>
+            <w:tcW w:type="dxa" w:w="7042"/>
+            <w:tcMar>
+              <w:top w:w="90" w:type="dxa"/>
+              <w:start w:w="120" w:type="dxa"/>
+              <w:bottom w:w="90" w:type="dxa"/>
+              <w:end w:w="120" w:type="dxa"/>
+            </w:tcMar>
+            <w:vAlign w:val="center"/>
+          </w:tcPr>
+          <w:p>
+            <w:pPr>
+              <w:spacing w:after="0" w:line="245" w:lineRule="auto"/>
+            </w:pPr>
+            <w:r>
+              <w:rPr>
+                <w:rFonts w:ascii="Aptos" w:hAnsi="Aptos"/>
+                <w:b w:val="0"/>
+                <w:i w:val="0"/>
+                <w:color w:val="102536"/>
+                <w:sz w:val="15"/>
+              </w:rPr>
+              <w:t>employee@masaar.demo  |  masaar-demo</w:t>
+            </w:r>
+          </w:p>
+        </w:tc>
+      </w:tr>
+      <w:tr>
+        <w:tc>
+          <w:tcPr>
+            <w:tcW w:type="dxa" w:w="2376"/>
+            <w:shd w:fill="F2F5F7"/>
+            <w:tcMar>
+              <w:top w:w="90" w:type="dxa"/>
+              <w:start w:w="120" w:type="dxa"/>
+              <w:bottom w:w="90" w:type="dxa"/>
+              <w:end w:w="120" w:type="dxa"/>
+            </w:tcMar>
+            <w:vAlign w:val="center"/>
+          </w:tcPr>
+          <w:p>
+            <w:pPr>
+              <w:spacing w:after="0" w:line="245" w:lineRule="auto"/>
+            </w:pPr>
+            <w:r>
+              <w:rPr>
+                <w:rFonts w:ascii="Aptos" w:hAnsi="Aptos"/>
+                <w:b w:val="0"/>
+                <w:i w:val="0"/>
+                <w:color w:val="102536"/>
+                <w:sz w:val="15"/>
+              </w:rPr>
+              <w:t>Driver — Karim</w:t>
+            </w:r>
+          </w:p>
+        </w:tc>
+        <w:tc>
+          <w:tcPr>
+            <w:tcW w:type="dxa" w:w="7042"/>
+            <w:shd w:fill="F2F5F7"/>
+            <w:tcMar>
+              <w:top w:w="90" w:type="dxa"/>
+              <w:start w:w="120" w:type="dxa"/>
+              <w:bottom w:w="90" w:type="dxa"/>
+              <w:end w:w="120" w:type="dxa"/>
+            </w:tcMar>
+            <w:vAlign w:val="center"/>
+          </w:tcPr>
+          <w:p>
+            <w:pPr>
+              <w:spacing w:after="0" w:line="245" w:lineRule="auto"/>
+            </w:pPr>
+            <w:r>
+              <w:rPr>
+                <w:rFonts w:ascii="Aptos" w:hAnsi="Aptos"/>
+                <w:b w:val="0"/>
+                <w:i w:val="0"/>
+                <w:color w:val="102536"/>
+                <w:sz w:val="15"/>
+              </w:rPr>
+              <w:t>driver@masaar.demo  |  masaar-demo</w:t>
+            </w:r>
+          </w:p>
+        </w:tc>
+      </w:tr>
+    </w:tbl>
+    <w:p>
+      <w:pPr>
+        <w:keepNext w:val="0"/>
+        <w:spacing w:before="0" w:after="20" w:line="264" w:lineRule="auto"/>
+      </w:pPr>
+      <w:r>
+        <w:rPr>
+          <w:rFonts w:ascii="Aptos" w:hAnsi="Aptos"/>
+          <w:b w:val="0"/>
+          <w:i w:val="0"/>
+          <w:color w:val="102536"/>
+          <w:sz w:val="4"/>
+        </w:rPr>
+      </w:r>
+    </w:p>
+    <w:p>
+      <w:pPr>
+        <w:keepNext w:val="0"/>
+        <w:spacing w:before="0" w:after="60" w:line="264" w:lineRule="auto"/>
+      </w:pPr>
+      <w:r>
+        <w:rPr>
+          <w:rFonts w:ascii="Aptos" w:hAnsi="Aptos"/>
+          <w:b w:val="0"/>
+          <w:i/>
+          <w:color w:val="60717D"/>
+          <w:sz w:val="15"/>
+        </w:rPr>
+        <w:t>Run pnpm dev and open http://localhost:5173. These fixed accounts and seeded records exist only in local/test mode; the public login never displays demo shortcuts and production requires Cognito.</w:t>
+      </w:r>
+    </w:p>
+    <w:p>
+      <w:pPr>
+        <w:pStyle w:val="Heading2"/>
+        <w:keepNext/>
+        <w:pageBreakBefore w:val="0"/>
+      </w:pPr>
+      <w:r>
         <w:t>Submission links and deliverables</w:t>
       </w:r>
     </w:p>
@@ -4771,7 +5119,7 @@
                 <w:b/>
                 <w:i w:val="0"/>
                 <w:color w:val="FFFFFF"/>
-                <w:sz w:val="16"/>
+                <w:sz w:val="15"/>
               </w:rPr>
               <w:t>Item</w:t>
             </w:r>
@@ -4799,7 +5147,7 @@
                 <w:b/>
                 <w:i w:val="0"/>
                 <w:color w:val="FFFFFF"/>
-                <w:sz w:val="16"/>
+                <w:sz w:val="15"/>
               </w:rPr>
               <w:t>Submission value</w:t>
             </w:r>
@@ -4828,7 +5176,7 @@
                 <w:b w:val="0"/>
                 <w:i w:val="0"/>
                 <w:color w:val="102536"/>
-                <w:sz w:val="16"/>
+                <w:sz w:val="15"/>
               </w:rPr>
               <w:t>Public GitHub</w:t>
             </w:r>
@@ -4855,9 +5203,9 @@
                 <w:b w:val="0"/>
                 <w:i w:val="0"/>
                 <w:color w:val="102536"/>
-                <w:sz w:val="16"/>
+                <w:sz w:val="15"/>
               </w:rPr>
-              <w:t>https://github.com/shawnlamouza/masaar  |  repository creation/push awaiting final GitHub-side authorization</w:t>
+              <w:t>https://github.com/shawnlamouza/Masaar</w:t>
             </w:r>
           </w:p>
         </w:tc>
@@ -4885,7 +5233,7 @@
                 <w:b w:val="0"/>
                 <w:i w:val="0"/>
                 <w:color w:val="102536"/>
-                <w:sz w:val="16"/>
+                <w:sz w:val="15"/>
               </w:rPr>
               <w:t>Public demo</w:t>
             </w:r>
@@ -4913,9 +5261,9 @@
                 <w:b w:val="0"/>
                 <w:i w:val="0"/>
                 <w:color w:val="102536"/>
-                <w:sz w:val="16"/>
+                <w:sz w:val="15"/>
               </w:rPr>
-              <w:t>AWS stack prepared; URL awaits account credentials, RDS and deployment.</w:t>
+              <w:t>AWS stack prepared; URL follows account verification, RDS and deployment.</w:t>
             </w:r>
           </w:p>
         </w:tc>
@@ -4942,7 +5290,7 @@
                 <w:b w:val="0"/>
                 <w:i w:val="0"/>
                 <w:color w:val="102536"/>
-                <w:sz w:val="16"/>
+                <w:sz w:val="15"/>
               </w:rPr>
               <w:t>Demo video</w:t>
             </w:r>
@@ -4969,9 +5317,9 @@
                 <w:b w:val="0"/>
                 <w:i w:val="0"/>
                 <w:color w:val="102536"/>
-                <w:sz w:val="16"/>
+                <w:sz w:val="15"/>
               </w:rPr>
-              <w:t>output/video/Masaar_2_Minute_Demo.mp4  |  upload link required after file creation.</w:t>
+              <w:t>output/video/Masaar_2_Minute_Demo.mp4  |  verified owner-led story, 1:45.</w:t>
             </w:r>
           </w:p>
         </w:tc>
@@ -4999,9 +5347,9 @@
                 <w:b w:val="0"/>
                 <w:i w:val="0"/>
                 <w:color w:val="102536"/>
-                <w:sz w:val="16"/>
+                <w:sz w:val="15"/>
               </w:rPr>
-              <w:t>Main report</w:t>
+              <w:t>Main package</w:t>
             </w:r>
           </w:p>
         </w:tc>
@@ -5027,65 +5375,9 @@
                 <w:b w:val="0"/>
                 <w:i w:val="0"/>
                 <w:color w:val="102536"/>
-                <w:sz w:val="16"/>
+                <w:sz w:val="15"/>
               </w:rPr>
-              <w:t>output/pdf/Masaar_Final_Submission.pdf + editable Word source</w:t>
-            </w:r>
-          </w:p>
-        </w:tc>
-      </w:tr>
-      <w:tr>
-        <w:tc>
-          <w:tcPr>
-            <w:tcW w:type="dxa" w:w="2232"/>
-            <w:tcMar>
-              <w:top w:w="90" w:type="dxa"/>
-              <w:start w:w="120" w:type="dxa"/>
-              <w:bottom w:w="90" w:type="dxa"/>
-              <w:end w:w="120" w:type="dxa"/>
-            </w:tcMar>
-            <w:vAlign w:val="center"/>
-          </w:tcPr>
-          <w:p>
-            <w:pPr>
-              <w:spacing w:after="0" w:line="245" w:lineRule="auto"/>
-            </w:pPr>
-            <w:r>
-              <w:rPr>
-                <w:rFonts w:ascii="Aptos" w:hAnsi="Aptos"/>
-                <w:b w:val="0"/>
-                <w:i w:val="0"/>
-                <w:color w:val="102536"/>
-                <w:sz w:val="16"/>
-              </w:rPr>
-              <w:t>Supporting package</w:t>
-            </w:r>
-          </w:p>
-        </w:tc>
-        <w:tc>
-          <w:tcPr>
-            <w:tcW w:type="dxa" w:w="7186"/>
-            <w:tcMar>
-              <w:top w:w="90" w:type="dxa"/>
-              <w:start w:w="120" w:type="dxa"/>
-              <w:bottom w:w="90" w:type="dxa"/>
-              <w:end w:w="120" w:type="dxa"/>
-            </w:tcMar>
-            <w:vAlign w:val="center"/>
-          </w:tcPr>
-          <w:p>
-            <w:pPr>
-              <w:spacing w:after="0" w:line="245" w:lineRule="auto"/>
-            </w:pPr>
-            <w:r>
-              <w:rPr>
-                <w:rFonts w:ascii="Aptos" w:hAnsi="Aptos"/>
-                <w:b w:val="0"/>
-                <w:i w:val="0"/>
-                <w:color w:val="102536"/>
-                <w:sz w:val="16"/>
-              </w:rPr>
-              <w:t>Functional specification, implementation plan, user manual, SQL scripts, source code and clean ZIP.</w:t>
+              <w:t>Final report, specification, implementation plan, manual, SQL scripts and clean source ZIP.</w:t>
             </w:r>
           </w:p>
         </w:tc>
@@ -5200,9 +5492,9 @@
           <w:b w:val="0"/>
           <w:i/>
           <w:color w:val="60717D"/>
-          <w:sz w:val="17"/>
+          <w:sz w:val="16"/>
         </w:rPr>
-        <w:t>Open external items before official submission: four teammate names, GitHub repository creation/push, AWS credentials/deployment and public video upload.</w:t>
+        <w:t>Open external items before official submission: four teammate names, AWS verification/deployment and a public upload URL for the completed 1:45 video.</w:t>
       </w:r>
     </w:p>
     <w:sectPr>

</xml_diff>